<commit_message>
docs(silver): update data quality and transformation slides ver3
</commit_message>
<xml_diff>
--- a/[Team 2] - Data Quality & Transformation - Update.docx
+++ b/[Team 2] - Data Quality & Transformation - Update.docx
@@ -23,6 +23,7 @@
     <w:p>
       <w:pPr>
         <w:spacing w:line="360" w:lineRule="auto"/>
+        <w:jc w:val="both"/>
         <w:rPr>
           <w:rFonts w:ascii="Times New Roman" w:hAnsi="Times New Roman" w:cs="Times New Roman"/>
           <w:sz w:val="26"/>
@@ -42,6 +43,7 @@
       <w:pPr>
         <w:pStyle w:val="Heading2"/>
         <w:spacing w:line="360" w:lineRule="auto"/>
+        <w:jc w:val="both"/>
         <w:rPr>
           <w:rFonts w:cs="Times New Roman"/>
         </w:rPr>
@@ -57,6 +59,7 @@
       <w:pPr>
         <w:pStyle w:val="isselectedend"/>
         <w:spacing w:line="360" w:lineRule="auto"/>
+        <w:jc w:val="both"/>
         <w:rPr>
           <w:sz w:val="26"/>
           <w:szCs w:val="26"/>
@@ -74,6 +77,7 @@
       <w:pPr>
         <w:pStyle w:val="isselectedend"/>
         <w:spacing w:line="360" w:lineRule="auto"/>
+        <w:jc w:val="both"/>
         <w:rPr>
           <w:sz w:val="26"/>
           <w:szCs w:val="26"/>
@@ -91,6 +95,7 @@
       <w:pPr>
         <w:pStyle w:val="NormalWeb"/>
         <w:spacing w:line="360" w:lineRule="auto"/>
+        <w:jc w:val="both"/>
         <w:rPr>
           <w:sz w:val="26"/>
           <w:szCs w:val="26"/>
@@ -729,12 +734,7 @@
               </w:rPr>
             </w:pPr>
             <w:r>
-              <w:rPr>
-                <w:rFonts w:ascii="Times New Roman" w:hAnsi="Times New Roman" w:cs="Times New Roman"/>
-                <w:sz w:val="26"/>
-                <w:szCs w:val="26"/>
-              </w:rPr>
-              <w:t>valid phone format</w:t>
+              <w:t>Phone number must contain exactly 10 digits</w:t>
             </w:r>
           </w:p>
         </w:tc>
@@ -1312,7 +1312,7 @@
         </w:tc>
         <w:tc>
           <w:tcPr>
-            <w:tcW w:w="2160" w:type="dxa"/>
+            <w:tcW w:w="2159" w:type="dxa"/>
           </w:tcPr>
           <w:p>
             <w:pPr>
@@ -1339,7 +1339,7 @@
         </w:tc>
         <w:tc>
           <w:tcPr>
-            <w:tcW w:w="2160" w:type="dxa"/>
+            <w:tcW w:w="2153" w:type="dxa"/>
           </w:tcPr>
           <w:p>
             <w:pPr>
@@ -1366,7 +1366,7 @@
         </w:tc>
         <w:tc>
           <w:tcPr>
-            <w:tcW w:w="2160" w:type="dxa"/>
+            <w:tcW w:w="2158" w:type="dxa"/>
           </w:tcPr>
           <w:p>
             <w:pPr>
@@ -1418,7 +1418,7 @@
         </w:tc>
         <w:tc>
           <w:tcPr>
-            <w:tcW w:w="2160" w:type="dxa"/>
+            <w:tcW w:w="2159" w:type="dxa"/>
           </w:tcPr>
           <w:p>
             <w:pPr>
@@ -1441,7 +1441,7 @@
         </w:tc>
         <w:tc>
           <w:tcPr>
-            <w:tcW w:w="2160" w:type="dxa"/>
+            <w:tcW w:w="2153" w:type="dxa"/>
           </w:tcPr>
           <w:p>
             <w:pPr>
@@ -1464,7 +1464,7 @@
         </w:tc>
         <w:tc>
           <w:tcPr>
-            <w:tcW w:w="2160" w:type="dxa"/>
+            <w:tcW w:w="2158" w:type="dxa"/>
           </w:tcPr>
           <w:p>
             <w:pPr>
@@ -1513,7 +1513,7 @@
         </w:tc>
         <w:tc>
           <w:tcPr>
-            <w:tcW w:w="2160" w:type="dxa"/>
+            <w:tcW w:w="2159" w:type="dxa"/>
           </w:tcPr>
           <w:p>
             <w:pPr>
@@ -1536,7 +1536,7 @@
         </w:tc>
         <w:tc>
           <w:tcPr>
-            <w:tcW w:w="2160" w:type="dxa"/>
+            <w:tcW w:w="2153" w:type="dxa"/>
           </w:tcPr>
           <w:p>
             <w:pPr>
@@ -1570,7 +1570,7 @@
         </w:tc>
         <w:tc>
           <w:tcPr>
-            <w:tcW w:w="2160" w:type="dxa"/>
+            <w:tcW w:w="2158" w:type="dxa"/>
           </w:tcPr>
           <w:p>
             <w:pPr>
@@ -1618,7 +1618,7 @@
         </w:tc>
         <w:tc>
           <w:tcPr>
-            <w:tcW w:w="2160" w:type="dxa"/>
+            <w:tcW w:w="2159" w:type="dxa"/>
           </w:tcPr>
           <w:p>
             <w:pPr>
@@ -1641,7 +1641,7 @@
         </w:tc>
         <w:tc>
           <w:tcPr>
-            <w:tcW w:w="2160" w:type="dxa"/>
+            <w:tcW w:w="2153" w:type="dxa"/>
           </w:tcPr>
           <w:p>
             <w:pPr>
@@ -1664,7 +1664,7 @@
         </w:tc>
         <w:tc>
           <w:tcPr>
-            <w:tcW w:w="2160" w:type="dxa"/>
+            <w:tcW w:w="2158" w:type="dxa"/>
           </w:tcPr>
           <w:p>
             <w:pPr>
@@ -1712,7 +1712,7 @@
         </w:tc>
         <w:tc>
           <w:tcPr>
-            <w:tcW w:w="2160" w:type="dxa"/>
+            <w:tcW w:w="2159" w:type="dxa"/>
           </w:tcPr>
           <w:p>
             <w:pPr>
@@ -1735,7 +1735,7 @@
         </w:tc>
         <w:tc>
           <w:tcPr>
-            <w:tcW w:w="2160" w:type="dxa"/>
+            <w:tcW w:w="2153" w:type="dxa"/>
           </w:tcPr>
           <w:p>
             <w:pPr>
@@ -1770,7 +1770,7 @@
         </w:tc>
         <w:tc>
           <w:tcPr>
-            <w:tcW w:w="2160" w:type="dxa"/>
+            <w:tcW w:w="2158" w:type="dxa"/>
           </w:tcPr>
           <w:tbl>
             <w:tblPr>
@@ -1910,7 +1910,7 @@
         </w:tc>
         <w:tc>
           <w:tcPr>
-            <w:tcW w:w="2160" w:type="dxa"/>
+            <w:tcW w:w="2159" w:type="dxa"/>
           </w:tcPr>
           <w:p>
             <w:pPr>
@@ -1933,7 +1933,7 @@
         </w:tc>
         <w:tc>
           <w:tcPr>
-            <w:tcW w:w="2160" w:type="dxa"/>
+            <w:tcW w:w="2153" w:type="dxa"/>
           </w:tcPr>
           <w:p>
             <w:pPr>
@@ -1968,7 +1968,7 @@
         </w:tc>
         <w:tc>
           <w:tcPr>
-            <w:tcW w:w="2160" w:type="dxa"/>
+            <w:tcW w:w="2158" w:type="dxa"/>
           </w:tcPr>
           <w:p>
             <w:pPr>
@@ -2016,7 +2016,7 @@
         </w:tc>
         <w:tc>
           <w:tcPr>
-            <w:tcW w:w="2160" w:type="dxa"/>
+            <w:tcW w:w="2159" w:type="dxa"/>
           </w:tcPr>
           <w:p>
             <w:pPr>
@@ -2039,7 +2039,7 @@
         </w:tc>
         <w:tc>
           <w:tcPr>
-            <w:tcW w:w="2160" w:type="dxa"/>
+            <w:tcW w:w="2153" w:type="dxa"/>
           </w:tcPr>
           <w:p>
             <w:pPr>
@@ -2057,7 +2057,7 @@
         </w:tc>
         <w:tc>
           <w:tcPr>
-            <w:tcW w:w="2160" w:type="dxa"/>
+            <w:tcW w:w="2158" w:type="dxa"/>
           </w:tcPr>
           <w:p>
             <w:pPr>
@@ -2105,7 +2105,89 @@
         </w:tc>
         <w:tc>
           <w:tcPr>
+            <w:tcW w:w="2159" w:type="dxa"/>
+          </w:tcPr>
+          <w:p>
+            <w:pPr>
+              <w:spacing w:line="360" w:lineRule="auto"/>
+              <w:rPr>
+                <w:rFonts w:ascii="Times New Roman" w:hAnsi="Times New Roman" w:cs="Times New Roman"/>
+                <w:sz w:val="26"/>
+                <w:szCs w:val="26"/>
+              </w:rPr>
+            </w:pPr>
+            <w:proofErr w:type="gramStart"/>
+            <w:r>
+              <w:rPr>
+                <w:rFonts w:ascii="Times New Roman" w:hAnsi="Times New Roman" w:cs="Times New Roman"/>
+                <w:sz w:val="26"/>
+                <w:szCs w:val="26"/>
+              </w:rPr>
+              <w:t>DECIMAL(</w:t>
+            </w:r>
+            <w:proofErr w:type="gramEnd"/>
+            <w:r>
+              <w:rPr>
+                <w:rFonts w:ascii="Times New Roman" w:hAnsi="Times New Roman" w:cs="Times New Roman"/>
+                <w:sz w:val="26"/>
+                <w:szCs w:val="26"/>
+              </w:rPr>
+              <w:t>18,2)</w:t>
+            </w:r>
+          </w:p>
+        </w:tc>
+        <w:tc>
+          <w:tcPr>
+            <w:tcW w:w="2153" w:type="dxa"/>
+          </w:tcPr>
+          <w:p>
+            <w:pPr>
+              <w:spacing w:line="360" w:lineRule="auto"/>
+              <w:rPr>
+                <w:rFonts w:ascii="Times New Roman" w:hAnsi="Times New Roman" w:cs="Times New Roman"/>
+                <w:sz w:val="26"/>
+                <w:szCs w:val="26"/>
+              </w:rPr>
+            </w:pPr>
+            <w:r>
+              <w:rPr>
+                <w:rFonts w:ascii="Times New Roman" w:hAnsi="Times New Roman" w:cs="Times New Roman"/>
+                <w:sz w:val="26"/>
+                <w:szCs w:val="26"/>
+              </w:rPr>
+              <w:t>&gt; 0</w:t>
+            </w:r>
+          </w:p>
+        </w:tc>
+        <w:tc>
+          <w:tcPr>
+            <w:tcW w:w="2158" w:type="dxa"/>
+          </w:tcPr>
+          <w:p>
+            <w:pPr>
+              <w:spacing w:line="360" w:lineRule="auto"/>
+              <w:rPr>
+                <w:rFonts w:ascii="Times New Roman" w:hAnsi="Times New Roman" w:cs="Times New Roman"/>
+                <w:sz w:val="26"/>
+                <w:szCs w:val="26"/>
+              </w:rPr>
+            </w:pPr>
+            <w:r>
+              <w:rPr>
+                <w:rFonts w:ascii="Times New Roman" w:hAnsi="Times New Roman" w:cs="Times New Roman"/>
+                <w:sz w:val="26"/>
+                <w:szCs w:val="26"/>
+              </w:rPr>
+              <w:t>invalid values → Error_Record</w:t>
+            </w:r>
+          </w:p>
+        </w:tc>
+      </w:tr>
+      <w:tr>
+        <w:tc>
+          <w:tcPr>
             <w:tcW w:w="2160" w:type="dxa"/>
+            <w:vAlign w:val="bottom"/>
           </w:tcPr>
           <w:p>
             <w:pPr>
@@ -2116,29 +2198,101 @@
                 <w:szCs w:val="26"/>
               </w:rPr>
             </w:pPr>
-            <w:proofErr w:type="gramStart"/>
-            <w:r>
+            <w:r>
+              <w:rPr>
+                <w:rFonts w:ascii="Times New Roman" w:eastAsia="Times New Roman" w:hAnsi="Times New Roman" w:cs="Times New Roman"/>
+                <w:sz w:val="26"/>
+                <w:szCs w:val="26"/>
+                <w:lang w:val="vi-VN" w:eastAsia="vi-VN"/>
+              </w:rPr>
+              <w:t>created_date</w:t>
+            </w:r>
+          </w:p>
+        </w:tc>
+        <w:tc>
+          <w:tcPr>
+            <w:tcW w:w="2159" w:type="dxa"/>
+            <w:vAlign w:val="bottom"/>
+          </w:tcPr>
+          <w:p>
+            <w:pPr>
+              <w:spacing w:line="360" w:lineRule="auto"/>
               <w:rPr>
                 <w:rFonts w:ascii="Times New Roman" w:hAnsi="Times New Roman" w:cs="Times New Roman"/>
                 <w:sz w:val="26"/>
                 <w:szCs w:val="26"/>
               </w:rPr>
-              <w:t>DECIMAL(</w:t>
-            </w:r>
-            <w:proofErr w:type="gramEnd"/>
-            <w:r>
+            </w:pPr>
+            <w:r>
+              <w:rPr>
+                <w:rFonts w:ascii="Times New Roman" w:eastAsia="Times New Roman" w:hAnsi="Times New Roman" w:cs="Times New Roman"/>
+                <w:sz w:val="26"/>
+                <w:szCs w:val="26"/>
+                <w:lang w:val="vi-VN" w:eastAsia="vi-VN"/>
+              </w:rPr>
+              <w:t>TIMESTAMP</w:t>
+            </w:r>
+          </w:p>
+        </w:tc>
+        <w:tc>
+          <w:tcPr>
+            <w:tcW w:w="2153" w:type="dxa"/>
+            <w:vAlign w:val="bottom"/>
+          </w:tcPr>
+          <w:p>
+            <w:pPr>
+              <w:spacing w:line="360" w:lineRule="auto"/>
               <w:rPr>
                 <w:rFonts w:ascii="Times New Roman" w:hAnsi="Times New Roman" w:cs="Times New Roman"/>
                 <w:sz w:val="26"/>
                 <w:szCs w:val="26"/>
               </w:rPr>
-              <w:t>18,2)</w:t>
-            </w:r>
-          </w:p>
-        </w:tc>
+            </w:pPr>
+            <w:r>
+              <w:rPr>
+                <w:rFonts w:ascii="Times New Roman" w:eastAsia="Times New Roman" w:hAnsi="Times New Roman" w:cs="Times New Roman"/>
+                <w:sz w:val="26"/>
+                <w:szCs w:val="26"/>
+                <w:lang w:val="vi-VN" w:eastAsia="vi-VN"/>
+              </w:rPr>
+              <w:t xml:space="preserve">not null, </w:t>
+            </w:r>
+            <w:r>
+              <w:rPr>
+                <w:rFonts w:ascii="Times New Roman" w:eastAsia="Times New Roman" w:hAnsi="Times New Roman" w:cs="Times New Roman"/>
+                <w:sz w:val="26"/>
+                <w:szCs w:val="26"/>
+                <w:lang w:val="vi-VN" w:eastAsia="vi-VN"/>
+              </w:rPr>
+              <w:t>valid date, &lt;= current_date</w:t>
+            </w:r>
+          </w:p>
+        </w:tc>
+        <w:tc>
+          <w:tcPr>
+            <w:tcW w:w="2158" w:type="dxa"/>
+            <w:vAlign w:val="bottom"/>
+          </w:tcPr>
+          <w:p>
+            <w:pPr>
+              <w:spacing w:line="360" w:lineRule="auto"/>
+              <w:rPr>
+                <w:rFonts w:ascii="Times New Roman" w:hAnsi="Times New Roman" w:cs="Times New Roman"/>
+                <w:sz w:val="26"/>
+                <w:szCs w:val="26"/>
+              </w:rPr>
+            </w:pPr>
+            <w:r>
+              <w:t>convert to ISO 8601 format; invalid → Error_Record</w:t>
+            </w:r>
+          </w:p>
+        </w:tc>
+      </w:tr>
+      <w:tr>
         <w:tc>
           <w:tcPr>
             <w:tcW w:w="2160" w:type="dxa"/>
+            <w:vAlign w:val="bottom"/>
           </w:tcPr>
           <w:p>
             <w:pPr>
@@ -2151,17 +2305,43 @@
             </w:pPr>
             <w:r>
               <w:rPr>
+                <w:rFonts w:ascii="Times New Roman" w:eastAsia="Times New Roman" w:hAnsi="Times New Roman" w:cs="Times New Roman"/>
+                <w:sz w:val="26"/>
+                <w:szCs w:val="26"/>
+                <w:lang w:val="vi-VN" w:eastAsia="vi-VN"/>
+              </w:rPr>
+              <w:t>updated_date</w:t>
+            </w:r>
+          </w:p>
+        </w:tc>
+        <w:tc>
+          <w:tcPr>
+            <w:tcW w:w="2159" w:type="dxa"/>
+            <w:vAlign w:val="bottom"/>
+          </w:tcPr>
+          <w:p>
+            <w:pPr>
+              <w:spacing w:line="360" w:lineRule="auto"/>
+              <w:rPr>
                 <w:rFonts w:ascii="Times New Roman" w:hAnsi="Times New Roman" w:cs="Times New Roman"/>
                 <w:sz w:val="26"/>
                 <w:szCs w:val="26"/>
               </w:rPr>
-              <w:t>&gt; 0</w:t>
-            </w:r>
-          </w:p>
-        </w:tc>
-        <w:tc>
-          <w:tcPr>
-            <w:tcW w:w="2160" w:type="dxa"/>
+            </w:pPr>
+            <w:r>
+              <w:rPr>
+                <w:rFonts w:ascii="Times New Roman" w:hAnsi="Times New Roman" w:cs="Times New Roman"/>
+                <w:sz w:val="26"/>
+                <w:szCs w:val="26"/>
+              </w:rPr>
+              <w:t>TIMESTAMP</w:t>
+            </w:r>
+          </w:p>
+        </w:tc>
+        <w:tc>
+          <w:tcPr>
+            <w:tcW w:w="2153" w:type="dxa"/>
+            <w:vAlign w:val="bottom"/>
           </w:tcPr>
           <w:p>
             <w:pPr>
@@ -2174,11 +2354,40 @@
             </w:pPr>
             <w:r>
               <w:rPr>
+                <w:rFonts w:ascii="Times New Roman" w:eastAsia="Times New Roman" w:hAnsi="Times New Roman" w:cs="Times New Roman"/>
+                <w:sz w:val="26"/>
+                <w:szCs w:val="26"/>
+                <w:lang w:val="vi-VN" w:eastAsia="vi-VN"/>
+              </w:rPr>
+              <w:t xml:space="preserve">not null, </w:t>
+            </w:r>
+            <w:r>
+              <w:rPr>
+                <w:rFonts w:ascii="Times New Roman" w:eastAsia="Times New Roman" w:hAnsi="Times New Roman" w:cs="Times New Roman"/>
+                <w:sz w:val="26"/>
+                <w:szCs w:val="26"/>
+                <w:lang w:val="vi-VN" w:eastAsia="vi-VN"/>
+              </w:rPr>
+              <w:t>valid date, &lt;= current_date</w:t>
+            </w:r>
+          </w:p>
+        </w:tc>
+        <w:tc>
+          <w:tcPr>
+            <w:tcW w:w="2158" w:type="dxa"/>
+            <w:vAlign w:val="bottom"/>
+          </w:tcPr>
+          <w:p>
+            <w:pPr>
+              <w:spacing w:line="360" w:lineRule="auto"/>
+              <w:rPr>
                 <w:rFonts w:ascii="Times New Roman" w:hAnsi="Times New Roman" w:cs="Times New Roman"/>
                 <w:sz w:val="26"/>
                 <w:szCs w:val="26"/>
               </w:rPr>
-              <w:t>invalid values → Error_Record</w:t>
+            </w:pPr>
+            <w:r>
+              <w:t>convert to ISO 8601 format; invalid → Error_Record</w:t>
             </w:r>
           </w:p>
         </w:tc>
@@ -2230,8 +2439,8 @@
       <w:tblGrid>
         <w:gridCol w:w="1679"/>
         <w:gridCol w:w="1593"/>
-        <w:gridCol w:w="2515"/>
-        <w:gridCol w:w="2837"/>
+        <w:gridCol w:w="2397"/>
+        <w:gridCol w:w="2955"/>
       </w:tblGrid>
       <w:tr>
         <w:trPr>
@@ -2449,6 +2658,7 @@
                 <w:szCs w:val="26"/>
                 <w:lang w:val="vi-VN" w:eastAsia="vi-VN"/>
               </w:rPr>
+              <w:lastRenderedPageBreak/>
               <w:t>agent_id</w:t>
             </w:r>
           </w:p>
@@ -3093,7 +3303,6 @@
                 <w:szCs w:val="26"/>
                 <w:lang w:val="vi-VN" w:eastAsia="vi-VN"/>
               </w:rPr>
-              <w:lastRenderedPageBreak/>
               <w:t>manager_name</w:t>
             </w:r>
           </w:p>
@@ -3375,31 +3584,7 @@
               </w:rPr>
             </w:pPr>
             <w:r>
-              <w:rPr>
-                <w:rFonts w:ascii="Times New Roman" w:eastAsia="Times New Roman" w:hAnsi="Times New Roman" w:cs="Times New Roman"/>
-                <w:sz w:val="26"/>
-                <w:szCs w:val="26"/>
-                <w:lang w:val="vi-VN" w:eastAsia="vi-VN"/>
-              </w:rPr>
-              <w:t>invalid dates</w:t>
-            </w:r>
-            <w:r>
-              <w:rPr>
-                <w:rFonts w:ascii="Times New Roman" w:eastAsia="Times New Roman" w:hAnsi="Times New Roman" w:cs="Times New Roman"/>
-                <w:sz w:val="26"/>
-                <w:szCs w:val="26"/>
-                <w:lang w:eastAsia="vi-VN"/>
-              </w:rPr>
-              <w:t>, null</w:t>
-            </w:r>
-            <w:r>
-              <w:rPr>
-                <w:rFonts w:ascii="Times New Roman" w:eastAsia="Times New Roman" w:hAnsi="Times New Roman" w:cs="Times New Roman"/>
-                <w:sz w:val="26"/>
-                <w:szCs w:val="26"/>
-                <w:lang w:val="vi-VN" w:eastAsia="vi-VN"/>
-              </w:rPr>
-              <w:t xml:space="preserve"> → Error_Record</w:t>
+              <w:t>convert to ISO 8601 format; invalid → Error_Record</w:t>
             </w:r>
           </w:p>
         </w:tc>
@@ -4406,7 +4591,16 @@
                 <w:szCs w:val="26"/>
                 <w:lang w:val="vi-VN" w:eastAsia="vi-VN"/>
               </w:rPr>
-              <w:t>valid values</w:t>
+              <w:t xml:space="preserve">not null, </w:t>
+            </w:r>
+            <w:r>
+              <w:rPr>
+                <w:rFonts w:ascii="Times New Roman" w:eastAsia="Times New Roman" w:hAnsi="Times New Roman" w:cs="Times New Roman"/>
+                <w:sz w:val="26"/>
+                <w:szCs w:val="26"/>
+                <w:lang w:val="vi-VN" w:eastAsia="vi-VN"/>
+              </w:rPr>
+              <w:t>valid date, &lt;= current_date</w:t>
             </w:r>
           </w:p>
         </w:tc>
@@ -4556,7 +4750,16 @@
                 <w:szCs w:val="26"/>
                 <w:lang w:val="vi-VN" w:eastAsia="vi-VN"/>
               </w:rPr>
-              <w:t>valid values</w:t>
+              <w:t xml:space="preserve">not null, </w:t>
+            </w:r>
+            <w:r>
+              <w:rPr>
+                <w:rFonts w:ascii="Times New Roman" w:eastAsia="Times New Roman" w:hAnsi="Times New Roman" w:cs="Times New Roman"/>
+                <w:sz w:val="26"/>
+                <w:szCs w:val="26"/>
+                <w:lang w:val="vi-VN" w:eastAsia="vi-VN"/>
+              </w:rPr>
+              <w:t>valid date, &lt;= current_date</w:t>
             </w:r>
           </w:p>
         </w:tc>
@@ -4617,12 +4820,13 @@
         <w:rPr>
           <w:rFonts w:cs="Times New Roman"/>
         </w:rPr>
+        <w:lastRenderedPageBreak/>
         <w:t>quotation</w:t>
       </w:r>
     </w:p>
     <w:tbl>
       <w:tblPr>
-        <w:tblW w:w="0" w:type="dxa"/>
+        <w:tblW w:w="8624" w:type="dxa"/>
         <w:tblCellMar>
           <w:left w:w="0" w:type="dxa"/>
           <w:right w:w="0" w:type="dxa"/>
@@ -5157,7 +5361,6 @@
                 <w:szCs w:val="26"/>
                 <w:lang w:val="vi-VN" w:eastAsia="vi-VN"/>
               </w:rPr>
-              <w:lastRenderedPageBreak/>
               <w:t>agent_id</w:t>
             </w:r>
           </w:p>
@@ -5982,6 +6185,7 @@
                 <w:szCs w:val="26"/>
                 <w:lang w:val="vi-VN" w:eastAsia="vi-VN"/>
               </w:rPr>
+              <w:lastRenderedPageBreak/>
               <w:t>premium_amount</w:t>
             </w:r>
           </w:p>
@@ -6114,6 +6318,326 @@
             <w:tcBorders>
               <w:top w:val="single" w:sz="6" w:space="0" w:color="CCCCCC"/>
               <w:left w:val="single" w:sz="6" w:space="0" w:color="000000"/>
+              <w:bottom w:val="single" w:sz="6" w:space="0" w:color="CCCCCC"/>
+              <w:right w:val="single" w:sz="6" w:space="0" w:color="000000"/>
+            </w:tcBorders>
+            <w:tcMar>
+              <w:top w:w="30" w:type="dxa"/>
+              <w:left w:w="45" w:type="dxa"/>
+              <w:bottom w:w="30" w:type="dxa"/>
+              <w:right w:w="45" w:type="dxa"/>
+            </w:tcMar>
+            <w:vAlign w:val="bottom"/>
+            <w:hideMark/>
+          </w:tcPr>
+          <w:p>
+            <w:pPr>
+              <w:spacing w:after="0" w:line="360" w:lineRule="auto"/>
+              <w:rPr>
+                <w:rFonts w:ascii="Times New Roman" w:eastAsia="Times New Roman" w:hAnsi="Times New Roman" w:cs="Times New Roman"/>
+                <w:sz w:val="26"/>
+                <w:szCs w:val="26"/>
+                <w:lang w:val="vi-VN" w:eastAsia="vi-VN"/>
+              </w:rPr>
+            </w:pPr>
+            <w:r>
+              <w:rPr>
+                <w:rFonts w:ascii="Times New Roman" w:eastAsia="Times New Roman" w:hAnsi="Times New Roman" w:cs="Times New Roman"/>
+                <w:sz w:val="26"/>
+                <w:szCs w:val="26"/>
+                <w:lang w:val="vi-VN" w:eastAsia="vi-VN"/>
+              </w:rPr>
+              <w:t>quotation_expiry_date</w:t>
+            </w:r>
+          </w:p>
+        </w:tc>
+        <w:tc>
+          <w:tcPr>
+            <w:tcW w:w="0" w:type="auto"/>
+            <w:tcBorders>
+              <w:top w:val="single" w:sz="6" w:space="0" w:color="CCCCCC"/>
+              <w:left w:val="single" w:sz="6" w:space="0" w:color="CCCCCC"/>
+              <w:bottom w:val="single" w:sz="6" w:space="0" w:color="CCCCCC"/>
+              <w:right w:val="single" w:sz="6" w:space="0" w:color="000000"/>
+            </w:tcBorders>
+            <w:tcMar>
+              <w:top w:w="30" w:type="dxa"/>
+              <w:left w:w="45" w:type="dxa"/>
+              <w:bottom w:w="30" w:type="dxa"/>
+              <w:right w:w="45" w:type="dxa"/>
+            </w:tcMar>
+            <w:vAlign w:val="bottom"/>
+            <w:hideMark/>
+          </w:tcPr>
+          <w:p>
+            <w:pPr>
+              <w:spacing w:after="0" w:line="360" w:lineRule="auto"/>
+              <w:rPr>
+                <w:rFonts w:ascii="Times New Roman" w:eastAsia="Times New Roman" w:hAnsi="Times New Roman" w:cs="Times New Roman"/>
+                <w:sz w:val="26"/>
+                <w:szCs w:val="26"/>
+                <w:lang w:val="vi-VN" w:eastAsia="vi-VN"/>
+              </w:rPr>
+            </w:pPr>
+            <w:r>
+              <w:rPr>
+                <w:rFonts w:ascii="Times New Roman" w:eastAsia="Times New Roman" w:hAnsi="Times New Roman" w:cs="Times New Roman"/>
+                <w:sz w:val="26"/>
+                <w:szCs w:val="26"/>
+                <w:lang w:val="vi-VN" w:eastAsia="vi-VN"/>
+              </w:rPr>
+              <w:t>DATE</w:t>
+            </w:r>
+          </w:p>
+        </w:tc>
+        <w:tc>
+          <w:tcPr>
+            <w:tcW w:w="0" w:type="auto"/>
+            <w:tcBorders>
+              <w:top w:val="single" w:sz="6" w:space="0" w:color="CCCCCC"/>
+              <w:left w:val="single" w:sz="6" w:space="0" w:color="CCCCCC"/>
+              <w:bottom w:val="single" w:sz="6" w:space="0" w:color="CCCCCC"/>
+              <w:right w:val="single" w:sz="6" w:space="0" w:color="000000"/>
+            </w:tcBorders>
+            <w:tcMar>
+              <w:top w:w="30" w:type="dxa"/>
+              <w:left w:w="45" w:type="dxa"/>
+              <w:bottom w:w="30" w:type="dxa"/>
+              <w:right w:w="45" w:type="dxa"/>
+            </w:tcMar>
+            <w:vAlign w:val="bottom"/>
+            <w:hideMark/>
+          </w:tcPr>
+          <w:p>
+            <w:pPr>
+              <w:spacing w:after="0" w:line="360" w:lineRule="auto"/>
+              <w:rPr>
+                <w:rFonts w:ascii="Times New Roman" w:eastAsia="Times New Roman" w:hAnsi="Times New Roman" w:cs="Times New Roman"/>
+                <w:sz w:val="26"/>
+                <w:szCs w:val="26"/>
+                <w:lang w:val="vi-VN" w:eastAsia="vi-VN"/>
+              </w:rPr>
+            </w:pPr>
+            <w:r>
+              <w:rPr>
+                <w:rFonts w:ascii="Times New Roman" w:eastAsia="Times New Roman" w:hAnsi="Times New Roman" w:cs="Times New Roman"/>
+                <w:sz w:val="26"/>
+                <w:szCs w:val="26"/>
+                <w:lang w:val="vi-VN" w:eastAsia="vi-VN"/>
+              </w:rPr>
+              <w:t>format yyyy-MM-dd, &gt;= quotation_date</w:t>
+            </w:r>
+          </w:p>
+        </w:tc>
+        <w:tc>
+          <w:tcPr>
+            <w:tcW w:w="0" w:type="auto"/>
+            <w:tcBorders>
+              <w:top w:val="single" w:sz="6" w:space="0" w:color="CCCCCC"/>
+              <w:left w:val="single" w:sz="6" w:space="0" w:color="CCCCCC"/>
+              <w:bottom w:val="single" w:sz="6" w:space="0" w:color="CCCCCC"/>
+              <w:right w:val="single" w:sz="6" w:space="0" w:color="CCCCCC"/>
+            </w:tcBorders>
+            <w:tcMar>
+              <w:top w:w="30" w:type="dxa"/>
+              <w:left w:w="0" w:type="dxa"/>
+              <w:bottom w:w="30" w:type="dxa"/>
+              <w:right w:w="0" w:type="dxa"/>
+            </w:tcMar>
+            <w:vAlign w:val="bottom"/>
+            <w:hideMark/>
+          </w:tcPr>
+          <w:p>
+            <w:pPr>
+              <w:spacing w:after="0" w:line="360" w:lineRule="auto"/>
+              <w:rPr>
+                <w:rFonts w:ascii="Times New Roman" w:eastAsia="Times New Roman" w:hAnsi="Times New Roman" w:cs="Times New Roman"/>
+                <w:sz w:val="26"/>
+                <w:szCs w:val="26"/>
+                <w:lang w:val="vi-VN" w:eastAsia="vi-VN"/>
+              </w:rPr>
+            </w:pPr>
+            <w:r>
+              <w:rPr>
+                <w:rFonts w:ascii="Times New Roman" w:eastAsia="Times New Roman" w:hAnsi="Times New Roman" w:cs="Times New Roman"/>
+                <w:sz w:val="26"/>
+                <w:szCs w:val="26"/>
+                <w:lang w:val="vi-VN" w:eastAsia="vi-VN"/>
+              </w:rPr>
+              <w:t>convert to ISO 8601 format; invalid → Error_Record</w:t>
+            </w:r>
+          </w:p>
+        </w:tc>
+      </w:tr>
+      <w:tr>
+        <w:trPr>
+          <w:trHeight w:val="315"/>
+        </w:trPr>
+        <w:tc>
+          <w:tcPr>
+            <w:tcW w:w="0" w:type="auto"/>
+            <w:tcBorders>
+              <w:top w:val="single" w:sz="6" w:space="0" w:color="CCCCCC"/>
+              <w:left w:val="single" w:sz="6" w:space="0" w:color="000000"/>
+              <w:bottom w:val="single" w:sz="6" w:space="0" w:color="CCCCCC"/>
+              <w:right w:val="single" w:sz="6" w:space="0" w:color="000000"/>
+            </w:tcBorders>
+            <w:tcMar>
+              <w:top w:w="30" w:type="dxa"/>
+              <w:left w:w="45" w:type="dxa"/>
+              <w:bottom w:w="30" w:type="dxa"/>
+              <w:right w:w="45" w:type="dxa"/>
+            </w:tcMar>
+            <w:vAlign w:val="bottom"/>
+          </w:tcPr>
+          <w:p>
+            <w:pPr>
+              <w:spacing w:after="0" w:line="360" w:lineRule="auto"/>
+              <w:rPr>
+                <w:rFonts w:ascii="Times New Roman" w:eastAsia="Times New Roman" w:hAnsi="Times New Roman" w:cs="Times New Roman"/>
+                <w:sz w:val="26"/>
+                <w:szCs w:val="26"/>
+                <w:lang w:val="vi-VN" w:eastAsia="vi-VN"/>
+              </w:rPr>
+            </w:pPr>
+            <w:r>
+              <w:rPr>
+                <w:rFonts w:ascii="Times New Roman" w:eastAsia="Times New Roman" w:hAnsi="Times New Roman" w:cs="Times New Roman"/>
+                <w:sz w:val="26"/>
+                <w:szCs w:val="26"/>
+                <w:lang w:val="vi-VN" w:eastAsia="vi-VN"/>
+              </w:rPr>
+              <w:t>created_date</w:t>
+            </w:r>
+          </w:p>
+        </w:tc>
+        <w:tc>
+          <w:tcPr>
+            <w:tcW w:w="0" w:type="auto"/>
+            <w:tcBorders>
+              <w:top w:val="single" w:sz="6" w:space="0" w:color="CCCCCC"/>
+              <w:left w:val="single" w:sz="6" w:space="0" w:color="CCCCCC"/>
+              <w:bottom w:val="single" w:sz="6" w:space="0" w:color="CCCCCC"/>
+              <w:right w:val="single" w:sz="6" w:space="0" w:color="000000"/>
+            </w:tcBorders>
+            <w:tcMar>
+              <w:top w:w="30" w:type="dxa"/>
+              <w:left w:w="45" w:type="dxa"/>
+              <w:bottom w:w="30" w:type="dxa"/>
+              <w:right w:w="45" w:type="dxa"/>
+            </w:tcMar>
+            <w:vAlign w:val="bottom"/>
+          </w:tcPr>
+          <w:p>
+            <w:pPr>
+              <w:spacing w:after="0" w:line="360" w:lineRule="auto"/>
+              <w:rPr>
+                <w:rFonts w:ascii="Times New Roman" w:eastAsia="Times New Roman" w:hAnsi="Times New Roman" w:cs="Times New Roman"/>
+                <w:sz w:val="26"/>
+                <w:szCs w:val="26"/>
+                <w:lang w:val="vi-VN" w:eastAsia="vi-VN"/>
+              </w:rPr>
+            </w:pPr>
+            <w:r>
+              <w:rPr>
+                <w:rFonts w:ascii="Times New Roman" w:hAnsi="Times New Roman" w:cs="Times New Roman"/>
+                <w:sz w:val="26"/>
+                <w:szCs w:val="26"/>
+              </w:rPr>
+              <w:t>TIMESTAMP</w:t>
+            </w:r>
+          </w:p>
+        </w:tc>
+        <w:tc>
+          <w:tcPr>
+            <w:tcW w:w="0" w:type="auto"/>
+            <w:tcBorders>
+              <w:top w:val="single" w:sz="6" w:space="0" w:color="CCCCCC"/>
+              <w:left w:val="single" w:sz="6" w:space="0" w:color="CCCCCC"/>
+              <w:bottom w:val="single" w:sz="6" w:space="0" w:color="CCCCCC"/>
+              <w:right w:val="single" w:sz="6" w:space="0" w:color="000000"/>
+            </w:tcBorders>
+            <w:tcMar>
+              <w:top w:w="30" w:type="dxa"/>
+              <w:left w:w="45" w:type="dxa"/>
+              <w:bottom w:w="30" w:type="dxa"/>
+              <w:right w:w="45" w:type="dxa"/>
+            </w:tcMar>
+            <w:vAlign w:val="bottom"/>
+          </w:tcPr>
+          <w:p>
+            <w:pPr>
+              <w:spacing w:after="0" w:line="360" w:lineRule="auto"/>
+              <w:rPr>
+                <w:rFonts w:ascii="Times New Roman" w:eastAsia="Times New Roman" w:hAnsi="Times New Roman" w:cs="Times New Roman"/>
+                <w:sz w:val="26"/>
+                <w:szCs w:val="26"/>
+                <w:lang w:val="vi-VN" w:eastAsia="vi-VN"/>
+              </w:rPr>
+            </w:pPr>
+            <w:r>
+              <w:rPr>
+                <w:rFonts w:ascii="Times New Roman" w:eastAsia="Times New Roman" w:hAnsi="Times New Roman" w:cs="Times New Roman"/>
+                <w:sz w:val="26"/>
+                <w:szCs w:val="26"/>
+                <w:lang w:val="vi-VN" w:eastAsia="vi-VN"/>
+              </w:rPr>
+              <w:t xml:space="preserve">not null, </w:t>
+            </w:r>
+            <w:r>
+              <w:rPr>
+                <w:rFonts w:ascii="Times New Roman" w:eastAsia="Times New Roman" w:hAnsi="Times New Roman" w:cs="Times New Roman"/>
+                <w:sz w:val="26"/>
+                <w:szCs w:val="26"/>
+                <w:lang w:val="vi-VN" w:eastAsia="vi-VN"/>
+              </w:rPr>
+              <w:t>valid date, &lt;= current_date</w:t>
+            </w:r>
+          </w:p>
+        </w:tc>
+        <w:tc>
+          <w:tcPr>
+            <w:tcW w:w="0" w:type="auto"/>
+            <w:tcBorders>
+              <w:top w:val="single" w:sz="6" w:space="0" w:color="CCCCCC"/>
+              <w:left w:val="single" w:sz="6" w:space="0" w:color="CCCCCC"/>
+              <w:bottom w:val="single" w:sz="6" w:space="0" w:color="CCCCCC"/>
+              <w:right w:val="single" w:sz="6" w:space="0" w:color="CCCCCC"/>
+            </w:tcBorders>
+            <w:tcMar>
+              <w:top w:w="30" w:type="dxa"/>
+              <w:left w:w="0" w:type="dxa"/>
+              <w:bottom w:w="30" w:type="dxa"/>
+              <w:right w:w="0" w:type="dxa"/>
+            </w:tcMar>
+            <w:vAlign w:val="bottom"/>
+          </w:tcPr>
+          <w:p>
+            <w:pPr>
+              <w:spacing w:after="0" w:line="360" w:lineRule="auto"/>
+              <w:rPr>
+                <w:rFonts w:ascii="Times New Roman" w:eastAsia="Times New Roman" w:hAnsi="Times New Roman" w:cs="Times New Roman"/>
+                <w:sz w:val="26"/>
+                <w:szCs w:val="26"/>
+                <w:lang w:val="vi-VN" w:eastAsia="vi-VN"/>
+              </w:rPr>
+            </w:pPr>
+            <w:r>
+              <w:t>convert to ISO 8601 format; invalid → Error_Record</w:t>
+            </w:r>
+          </w:p>
+        </w:tc>
+      </w:tr>
+      <w:tr>
+        <w:trPr>
+          <w:trHeight w:val="315"/>
+        </w:trPr>
+        <w:tc>
+          <w:tcPr>
+            <w:tcW w:w="0" w:type="auto"/>
+            <w:tcBorders>
+              <w:top w:val="single" w:sz="6" w:space="0" w:color="CCCCCC"/>
+              <w:left w:val="single" w:sz="6" w:space="0" w:color="000000"/>
               <w:bottom w:val="single" w:sz="6" w:space="0" w:color="000000"/>
               <w:right w:val="single" w:sz="6" w:space="0" w:color="000000"/>
             </w:tcBorders>
@@ -6124,7 +6648,6 @@
               <w:right w:w="45" w:type="dxa"/>
             </w:tcMar>
             <w:vAlign w:val="bottom"/>
-            <w:hideMark/>
           </w:tcPr>
           <w:p>
             <w:pPr>
@@ -6143,7 +6666,7 @@
                 <w:szCs w:val="26"/>
                 <w:lang w:val="vi-VN" w:eastAsia="vi-VN"/>
               </w:rPr>
-              <w:t>quotation_expiry_date</w:t>
+              <w:t>updated_date</w:t>
             </w:r>
           </w:p>
         </w:tc>
@@ -6163,7 +6686,6 @@
               <w:right w:w="45" w:type="dxa"/>
             </w:tcMar>
             <w:vAlign w:val="bottom"/>
-            <w:hideMark/>
           </w:tcPr>
           <w:p>
             <w:pPr>
@@ -6177,12 +6699,11 @@
             </w:pPr>
             <w:r>
               <w:rPr>
-                <w:rFonts w:ascii="Times New Roman" w:eastAsia="Times New Roman" w:hAnsi="Times New Roman" w:cs="Times New Roman"/>
-                <w:sz w:val="26"/>
-                <w:szCs w:val="26"/>
-                <w:lang w:val="vi-VN" w:eastAsia="vi-VN"/>
-              </w:rPr>
-              <w:t>DATE</w:t>
+                <w:rFonts w:ascii="Times New Roman" w:hAnsi="Times New Roman" w:cs="Times New Roman"/>
+                <w:sz w:val="26"/>
+                <w:szCs w:val="26"/>
+              </w:rPr>
+              <w:t>TIMESTAMP</w:t>
             </w:r>
           </w:p>
         </w:tc>
@@ -6202,7 +6723,6 @@
               <w:right w:w="45" w:type="dxa"/>
             </w:tcMar>
             <w:vAlign w:val="bottom"/>
-            <w:hideMark/>
           </w:tcPr>
           <w:p>
             <w:pPr>
@@ -6221,7 +6741,16 @@
                 <w:szCs w:val="26"/>
                 <w:lang w:val="vi-VN" w:eastAsia="vi-VN"/>
               </w:rPr>
-              <w:t>format yyyy-MM-dd, &gt;= quotation_date</w:t>
+              <w:t xml:space="preserve">not null, </w:t>
+            </w:r>
+            <w:r>
+              <w:rPr>
+                <w:rFonts w:ascii="Times New Roman" w:eastAsia="Times New Roman" w:hAnsi="Times New Roman" w:cs="Times New Roman"/>
+                <w:sz w:val="26"/>
+                <w:szCs w:val="26"/>
+                <w:lang w:val="vi-VN" w:eastAsia="vi-VN"/>
+              </w:rPr>
+              <w:t>valid date, &lt;= current_date</w:t>
             </w:r>
           </w:p>
         </w:tc>
@@ -6241,7 +6770,6 @@
               <w:right w:w="0" w:type="dxa"/>
             </w:tcMar>
             <w:vAlign w:val="bottom"/>
-            <w:hideMark/>
           </w:tcPr>
           <w:p>
             <w:pPr>
@@ -6254,12 +6782,6 @@
               </w:rPr>
             </w:pPr>
             <w:r>
-              <w:rPr>
-                <w:rFonts w:ascii="Times New Roman" w:eastAsia="Times New Roman" w:hAnsi="Times New Roman" w:cs="Times New Roman"/>
-                <w:sz w:val="26"/>
-                <w:szCs w:val="26"/>
-                <w:lang w:val="vi-VN" w:eastAsia="vi-VN"/>
-              </w:rPr>
               <w:t>convert to ISO 8601 format; invalid → Error_Record</w:t>
             </w:r>
           </w:p>
@@ -6288,13 +6810,12 @@
         <w:rPr>
           <w:rFonts w:cs="Times New Roman"/>
         </w:rPr>
-        <w:lastRenderedPageBreak/>
         <w:t>quotation_item</w:t>
       </w:r>
     </w:p>
     <w:tbl>
       <w:tblPr>
-        <w:tblW w:w="0" w:type="dxa"/>
+        <w:tblW w:w="8624" w:type="dxa"/>
         <w:tblCellMar>
           <w:left w:w="0" w:type="dxa"/>
           <w:right w:w="0" w:type="dxa"/>
@@ -6304,8 +6825,8 @@
       <w:tblGrid>
         <w:gridCol w:w="2083"/>
         <w:gridCol w:w="1903"/>
-        <w:gridCol w:w="2140"/>
-        <w:gridCol w:w="2498"/>
+        <w:gridCol w:w="2305"/>
+        <w:gridCol w:w="2333"/>
       </w:tblGrid>
       <w:tr>
         <w:trPr>
@@ -7122,6 +7643,327 @@
             <w:tcBorders>
               <w:top w:val="single" w:sz="6" w:space="0" w:color="CCCCCC"/>
               <w:left w:val="single" w:sz="6" w:space="0" w:color="000000"/>
+              <w:bottom w:val="single" w:sz="6" w:space="0" w:color="CCCCCC"/>
+              <w:right w:val="single" w:sz="6" w:space="0" w:color="000000"/>
+            </w:tcBorders>
+            <w:tcMar>
+              <w:top w:w="30" w:type="dxa"/>
+              <w:left w:w="45" w:type="dxa"/>
+              <w:bottom w:w="30" w:type="dxa"/>
+              <w:right w:w="45" w:type="dxa"/>
+            </w:tcMar>
+            <w:vAlign w:val="bottom"/>
+            <w:hideMark/>
+          </w:tcPr>
+          <w:p>
+            <w:pPr>
+              <w:spacing w:after="0" w:line="360" w:lineRule="auto"/>
+              <w:rPr>
+                <w:rFonts w:ascii="Times New Roman" w:eastAsia="Times New Roman" w:hAnsi="Times New Roman" w:cs="Times New Roman"/>
+                <w:sz w:val="26"/>
+                <w:szCs w:val="26"/>
+                <w:lang w:val="vi-VN" w:eastAsia="vi-VN"/>
+              </w:rPr>
+            </w:pPr>
+            <w:r>
+              <w:rPr>
+                <w:rFonts w:ascii="Times New Roman" w:eastAsia="Times New Roman" w:hAnsi="Times New Roman" w:cs="Times New Roman"/>
+                <w:sz w:val="26"/>
+                <w:szCs w:val="26"/>
+                <w:lang w:val="vi-VN" w:eastAsia="vi-VN"/>
+              </w:rPr>
+              <w:lastRenderedPageBreak/>
+              <w:t>deductible_amount</w:t>
+            </w:r>
+          </w:p>
+        </w:tc>
+        <w:tc>
+          <w:tcPr>
+            <w:tcW w:w="0" w:type="auto"/>
+            <w:tcBorders>
+              <w:top w:val="single" w:sz="6" w:space="0" w:color="CCCCCC"/>
+              <w:left w:val="single" w:sz="6" w:space="0" w:color="CCCCCC"/>
+              <w:bottom w:val="single" w:sz="6" w:space="0" w:color="CCCCCC"/>
+              <w:right w:val="single" w:sz="6" w:space="0" w:color="000000"/>
+            </w:tcBorders>
+            <w:tcMar>
+              <w:top w:w="30" w:type="dxa"/>
+              <w:left w:w="45" w:type="dxa"/>
+              <w:bottom w:w="30" w:type="dxa"/>
+              <w:right w:w="45" w:type="dxa"/>
+            </w:tcMar>
+            <w:vAlign w:val="bottom"/>
+            <w:hideMark/>
+          </w:tcPr>
+          <w:p>
+            <w:pPr>
+              <w:spacing w:after="0" w:line="360" w:lineRule="auto"/>
+              <w:rPr>
+                <w:rFonts w:ascii="Times New Roman" w:eastAsia="Times New Roman" w:hAnsi="Times New Roman" w:cs="Times New Roman"/>
+                <w:sz w:val="26"/>
+                <w:szCs w:val="26"/>
+                <w:lang w:val="vi-VN" w:eastAsia="vi-VN"/>
+              </w:rPr>
+            </w:pPr>
+            <w:r>
+              <w:rPr>
+                <w:rFonts w:ascii="Times New Roman" w:eastAsia="Times New Roman" w:hAnsi="Times New Roman" w:cs="Times New Roman"/>
+                <w:sz w:val="26"/>
+                <w:szCs w:val="26"/>
+                <w:lang w:val="vi-VN" w:eastAsia="vi-VN"/>
+              </w:rPr>
+              <w:t>DECIMAL(18,2)</w:t>
+            </w:r>
+          </w:p>
+        </w:tc>
+        <w:tc>
+          <w:tcPr>
+            <w:tcW w:w="0" w:type="auto"/>
+            <w:tcBorders>
+              <w:top w:val="single" w:sz="6" w:space="0" w:color="CCCCCC"/>
+              <w:left w:val="single" w:sz="6" w:space="0" w:color="CCCCCC"/>
+              <w:bottom w:val="single" w:sz="6" w:space="0" w:color="CCCCCC"/>
+              <w:right w:val="single" w:sz="6" w:space="0" w:color="000000"/>
+            </w:tcBorders>
+            <w:tcMar>
+              <w:top w:w="30" w:type="dxa"/>
+              <w:left w:w="45" w:type="dxa"/>
+              <w:bottom w:w="30" w:type="dxa"/>
+              <w:right w:w="45" w:type="dxa"/>
+            </w:tcMar>
+            <w:vAlign w:val="bottom"/>
+            <w:hideMark/>
+          </w:tcPr>
+          <w:p>
+            <w:pPr>
+              <w:spacing w:after="0" w:line="360" w:lineRule="auto"/>
+              <w:rPr>
+                <w:rFonts w:ascii="Times New Roman" w:eastAsia="Times New Roman" w:hAnsi="Times New Roman" w:cs="Times New Roman"/>
+                <w:sz w:val="26"/>
+                <w:szCs w:val="26"/>
+                <w:lang w:val="vi-VN" w:eastAsia="vi-VN"/>
+              </w:rPr>
+            </w:pPr>
+            <w:r>
+              <w:rPr>
+                <w:rFonts w:ascii="Times New Roman" w:eastAsia="Times New Roman" w:hAnsi="Times New Roman" w:cs="Times New Roman"/>
+                <w:sz w:val="26"/>
+                <w:szCs w:val="26"/>
+                <w:lang w:val="vi-VN" w:eastAsia="vi-VN"/>
+              </w:rPr>
+              <w:t>&gt;= 0, &lt; coverage_amount</w:t>
+            </w:r>
+          </w:p>
+        </w:tc>
+        <w:tc>
+          <w:tcPr>
+            <w:tcW w:w="0" w:type="auto"/>
+            <w:tcBorders>
+              <w:top w:val="single" w:sz="6" w:space="0" w:color="CCCCCC"/>
+              <w:left w:val="single" w:sz="6" w:space="0" w:color="CCCCCC"/>
+              <w:bottom w:val="single" w:sz="6" w:space="0" w:color="CCCCCC"/>
+              <w:right w:val="single" w:sz="6" w:space="0" w:color="CCCCCC"/>
+            </w:tcBorders>
+            <w:tcMar>
+              <w:top w:w="30" w:type="dxa"/>
+              <w:left w:w="0" w:type="dxa"/>
+              <w:bottom w:w="30" w:type="dxa"/>
+              <w:right w:w="0" w:type="dxa"/>
+            </w:tcMar>
+            <w:vAlign w:val="bottom"/>
+            <w:hideMark/>
+          </w:tcPr>
+          <w:p>
+            <w:pPr>
+              <w:spacing w:after="0" w:line="360" w:lineRule="auto"/>
+              <w:rPr>
+                <w:rFonts w:ascii="Times New Roman" w:eastAsia="Times New Roman" w:hAnsi="Times New Roman" w:cs="Times New Roman"/>
+                <w:sz w:val="26"/>
+                <w:szCs w:val="26"/>
+                <w:lang w:val="vi-VN" w:eastAsia="vi-VN"/>
+              </w:rPr>
+            </w:pPr>
+            <w:r>
+              <w:rPr>
+                <w:rFonts w:ascii="Times New Roman" w:eastAsia="Times New Roman" w:hAnsi="Times New Roman" w:cs="Times New Roman"/>
+                <w:sz w:val="26"/>
+                <w:szCs w:val="26"/>
+                <w:lang w:val="vi-VN" w:eastAsia="vi-VN"/>
+              </w:rPr>
+              <w:t>round to 2 decimals; invalid → Error_Record</w:t>
+            </w:r>
+          </w:p>
+        </w:tc>
+      </w:tr>
+      <w:tr>
+        <w:trPr>
+          <w:trHeight w:val="315"/>
+        </w:trPr>
+        <w:tc>
+          <w:tcPr>
+            <w:tcW w:w="0" w:type="auto"/>
+            <w:tcBorders>
+              <w:top w:val="single" w:sz="6" w:space="0" w:color="CCCCCC"/>
+              <w:left w:val="single" w:sz="6" w:space="0" w:color="000000"/>
+              <w:bottom w:val="single" w:sz="6" w:space="0" w:color="CCCCCC"/>
+              <w:right w:val="single" w:sz="6" w:space="0" w:color="000000"/>
+            </w:tcBorders>
+            <w:tcMar>
+              <w:top w:w="30" w:type="dxa"/>
+              <w:left w:w="45" w:type="dxa"/>
+              <w:bottom w:w="30" w:type="dxa"/>
+              <w:right w:w="45" w:type="dxa"/>
+            </w:tcMar>
+            <w:vAlign w:val="bottom"/>
+          </w:tcPr>
+          <w:p>
+            <w:pPr>
+              <w:spacing w:after="0" w:line="360" w:lineRule="auto"/>
+              <w:rPr>
+                <w:rFonts w:ascii="Times New Roman" w:eastAsia="Times New Roman" w:hAnsi="Times New Roman" w:cs="Times New Roman"/>
+                <w:sz w:val="26"/>
+                <w:szCs w:val="26"/>
+                <w:lang w:val="vi-VN" w:eastAsia="vi-VN"/>
+              </w:rPr>
+            </w:pPr>
+            <w:r>
+              <w:rPr>
+                <w:rFonts w:ascii="Times New Roman" w:eastAsia="Times New Roman" w:hAnsi="Times New Roman" w:cs="Times New Roman"/>
+                <w:sz w:val="26"/>
+                <w:szCs w:val="26"/>
+                <w:lang w:val="vi-VN" w:eastAsia="vi-VN"/>
+              </w:rPr>
+              <w:t>created_date</w:t>
+            </w:r>
+          </w:p>
+        </w:tc>
+        <w:tc>
+          <w:tcPr>
+            <w:tcW w:w="0" w:type="auto"/>
+            <w:tcBorders>
+              <w:top w:val="single" w:sz="6" w:space="0" w:color="CCCCCC"/>
+              <w:left w:val="single" w:sz="6" w:space="0" w:color="CCCCCC"/>
+              <w:bottom w:val="single" w:sz="6" w:space="0" w:color="CCCCCC"/>
+              <w:right w:val="single" w:sz="6" w:space="0" w:color="000000"/>
+            </w:tcBorders>
+            <w:tcMar>
+              <w:top w:w="30" w:type="dxa"/>
+              <w:left w:w="45" w:type="dxa"/>
+              <w:bottom w:w="30" w:type="dxa"/>
+              <w:right w:w="45" w:type="dxa"/>
+            </w:tcMar>
+            <w:vAlign w:val="bottom"/>
+          </w:tcPr>
+          <w:p>
+            <w:pPr>
+              <w:spacing w:after="0" w:line="360" w:lineRule="auto"/>
+              <w:rPr>
+                <w:rFonts w:ascii="Times New Roman" w:eastAsia="Times New Roman" w:hAnsi="Times New Roman" w:cs="Times New Roman"/>
+                <w:sz w:val="26"/>
+                <w:szCs w:val="26"/>
+                <w:lang w:val="vi-VN" w:eastAsia="vi-VN"/>
+              </w:rPr>
+            </w:pPr>
+            <w:r>
+              <w:rPr>
+                <w:rFonts w:ascii="Times New Roman" w:hAnsi="Times New Roman" w:cs="Times New Roman"/>
+                <w:sz w:val="26"/>
+                <w:szCs w:val="26"/>
+              </w:rPr>
+              <w:t>TIMESTAMP</w:t>
+            </w:r>
+          </w:p>
+        </w:tc>
+        <w:tc>
+          <w:tcPr>
+            <w:tcW w:w="0" w:type="auto"/>
+            <w:tcBorders>
+              <w:top w:val="single" w:sz="6" w:space="0" w:color="CCCCCC"/>
+              <w:left w:val="single" w:sz="6" w:space="0" w:color="CCCCCC"/>
+              <w:bottom w:val="single" w:sz="6" w:space="0" w:color="CCCCCC"/>
+              <w:right w:val="single" w:sz="6" w:space="0" w:color="000000"/>
+            </w:tcBorders>
+            <w:tcMar>
+              <w:top w:w="30" w:type="dxa"/>
+              <w:left w:w="45" w:type="dxa"/>
+              <w:bottom w:w="30" w:type="dxa"/>
+              <w:right w:w="45" w:type="dxa"/>
+            </w:tcMar>
+            <w:vAlign w:val="bottom"/>
+          </w:tcPr>
+          <w:p>
+            <w:pPr>
+              <w:spacing w:after="0" w:line="360" w:lineRule="auto"/>
+              <w:rPr>
+                <w:rFonts w:ascii="Times New Roman" w:eastAsia="Times New Roman" w:hAnsi="Times New Roman" w:cs="Times New Roman"/>
+                <w:sz w:val="26"/>
+                <w:szCs w:val="26"/>
+                <w:lang w:val="vi-VN" w:eastAsia="vi-VN"/>
+              </w:rPr>
+            </w:pPr>
+            <w:r>
+              <w:rPr>
+                <w:rFonts w:ascii="Times New Roman" w:eastAsia="Times New Roman" w:hAnsi="Times New Roman" w:cs="Times New Roman"/>
+                <w:sz w:val="26"/>
+                <w:szCs w:val="26"/>
+                <w:lang w:val="vi-VN" w:eastAsia="vi-VN"/>
+              </w:rPr>
+              <w:t xml:space="preserve">not null, </w:t>
+            </w:r>
+            <w:r>
+              <w:rPr>
+                <w:rFonts w:ascii="Times New Roman" w:eastAsia="Times New Roman" w:hAnsi="Times New Roman" w:cs="Times New Roman"/>
+                <w:sz w:val="26"/>
+                <w:szCs w:val="26"/>
+                <w:lang w:val="vi-VN" w:eastAsia="vi-VN"/>
+              </w:rPr>
+              <w:t>valid date, &lt;= current_date</w:t>
+            </w:r>
+          </w:p>
+        </w:tc>
+        <w:tc>
+          <w:tcPr>
+            <w:tcW w:w="0" w:type="auto"/>
+            <w:tcBorders>
+              <w:top w:val="single" w:sz="6" w:space="0" w:color="CCCCCC"/>
+              <w:left w:val="single" w:sz="6" w:space="0" w:color="CCCCCC"/>
+              <w:bottom w:val="single" w:sz="6" w:space="0" w:color="CCCCCC"/>
+              <w:right w:val="single" w:sz="6" w:space="0" w:color="CCCCCC"/>
+            </w:tcBorders>
+            <w:tcMar>
+              <w:top w:w="30" w:type="dxa"/>
+              <w:left w:w="0" w:type="dxa"/>
+              <w:bottom w:w="30" w:type="dxa"/>
+              <w:right w:w="0" w:type="dxa"/>
+            </w:tcMar>
+            <w:vAlign w:val="bottom"/>
+          </w:tcPr>
+          <w:p>
+            <w:pPr>
+              <w:spacing w:after="0" w:line="360" w:lineRule="auto"/>
+              <w:rPr>
+                <w:rFonts w:ascii="Times New Roman" w:eastAsia="Times New Roman" w:hAnsi="Times New Roman" w:cs="Times New Roman"/>
+                <w:sz w:val="26"/>
+                <w:szCs w:val="26"/>
+                <w:lang w:val="vi-VN" w:eastAsia="vi-VN"/>
+              </w:rPr>
+            </w:pPr>
+            <w:r>
+              <w:t>convert to ISO 8601 format; invalid → Error_Record</w:t>
+            </w:r>
+          </w:p>
+        </w:tc>
+      </w:tr>
+      <w:tr>
+        <w:trPr>
+          <w:trHeight w:val="315"/>
+        </w:trPr>
+        <w:tc>
+          <w:tcPr>
+            <w:tcW w:w="0" w:type="auto"/>
+            <w:tcBorders>
+              <w:top w:val="single" w:sz="6" w:space="0" w:color="CCCCCC"/>
+              <w:left w:val="single" w:sz="6" w:space="0" w:color="000000"/>
               <w:bottom w:val="single" w:sz="6" w:space="0" w:color="000000"/>
               <w:right w:val="single" w:sz="6" w:space="0" w:color="000000"/>
             </w:tcBorders>
@@ -7132,7 +7974,6 @@
               <w:right w:w="45" w:type="dxa"/>
             </w:tcMar>
             <w:vAlign w:val="bottom"/>
-            <w:hideMark/>
           </w:tcPr>
           <w:p>
             <w:pPr>
@@ -7151,7 +7992,7 @@
                 <w:szCs w:val="26"/>
                 <w:lang w:val="vi-VN" w:eastAsia="vi-VN"/>
               </w:rPr>
-              <w:t>deductible_amount</w:t>
+              <w:t>updated_date</w:t>
             </w:r>
           </w:p>
         </w:tc>
@@ -7171,7 +8012,6 @@
               <w:right w:w="45" w:type="dxa"/>
             </w:tcMar>
             <w:vAlign w:val="bottom"/>
-            <w:hideMark/>
           </w:tcPr>
           <w:p>
             <w:pPr>
@@ -7185,12 +8025,11 @@
             </w:pPr>
             <w:r>
               <w:rPr>
-                <w:rFonts w:ascii="Times New Roman" w:eastAsia="Times New Roman" w:hAnsi="Times New Roman" w:cs="Times New Roman"/>
-                <w:sz w:val="26"/>
-                <w:szCs w:val="26"/>
-                <w:lang w:val="vi-VN" w:eastAsia="vi-VN"/>
-              </w:rPr>
-              <w:t>DECIMAL(18,2)</w:t>
+                <w:rFonts w:ascii="Times New Roman" w:hAnsi="Times New Roman" w:cs="Times New Roman"/>
+                <w:sz w:val="26"/>
+                <w:szCs w:val="26"/>
+              </w:rPr>
+              <w:t>TIMESTAMP</w:t>
             </w:r>
           </w:p>
         </w:tc>
@@ -7210,7 +8049,6 @@
               <w:right w:w="45" w:type="dxa"/>
             </w:tcMar>
             <w:vAlign w:val="bottom"/>
-            <w:hideMark/>
           </w:tcPr>
           <w:p>
             <w:pPr>
@@ -7229,7 +8067,16 @@
                 <w:szCs w:val="26"/>
                 <w:lang w:val="vi-VN" w:eastAsia="vi-VN"/>
               </w:rPr>
-              <w:t>&gt;= 0, &lt; coverage_amount</w:t>
+              <w:t xml:space="preserve">not null, </w:t>
+            </w:r>
+            <w:r>
+              <w:rPr>
+                <w:rFonts w:ascii="Times New Roman" w:eastAsia="Times New Roman" w:hAnsi="Times New Roman" w:cs="Times New Roman"/>
+                <w:sz w:val="26"/>
+                <w:szCs w:val="26"/>
+                <w:lang w:val="vi-VN" w:eastAsia="vi-VN"/>
+              </w:rPr>
+              <w:t>valid date, &lt;= current_date</w:t>
             </w:r>
           </w:p>
         </w:tc>
@@ -7249,7 +8096,6 @@
               <w:right w:w="0" w:type="dxa"/>
             </w:tcMar>
             <w:vAlign w:val="bottom"/>
-            <w:hideMark/>
           </w:tcPr>
           <w:p>
             <w:pPr>
@@ -7262,13 +8108,7 @@
               </w:rPr>
             </w:pPr>
             <w:r>
-              <w:rPr>
-                <w:rFonts w:ascii="Times New Roman" w:eastAsia="Times New Roman" w:hAnsi="Times New Roman" w:cs="Times New Roman"/>
-                <w:sz w:val="26"/>
-                <w:szCs w:val="26"/>
-                <w:lang w:val="vi-VN" w:eastAsia="vi-VN"/>
-              </w:rPr>
-              <w:t>round to 2 decimals; invalid → Error_Record</w:t>
+              <w:t>convert to ISO 8601 format; invalid → Error_Record</w:t>
             </w:r>
           </w:p>
         </w:tc>
@@ -8009,7 +8849,6 @@
                 <w:szCs w:val="26"/>
                 <w:lang w:val="vi-VN" w:eastAsia="vi-VN"/>
               </w:rPr>
-              <w:lastRenderedPageBreak/>
               <w:t>provider_code</w:t>
             </w:r>
           </w:p>
@@ -8502,6 +9341,7 @@
                 <w:szCs w:val="26"/>
                 <w:lang w:val="vi-VN" w:eastAsia="vi-VN"/>
               </w:rPr>
+              <w:lastRenderedPageBreak/>
               <w:t>policy_end_date</w:t>
             </w:r>
           </w:p>
@@ -9703,7 +10543,6 @@
                 <w:szCs w:val="26"/>
                 <w:lang w:val="vi-VN" w:eastAsia="vi-VN"/>
               </w:rPr>
-              <w:lastRenderedPageBreak/>
               <w:t>cancellation_date</w:t>
             </w:r>
           </w:p>
@@ -10164,6 +11003,7 @@
         <w:rPr>
           <w:rFonts w:cs="Times New Roman"/>
         </w:rPr>
+        <w:lastRenderedPageBreak/>
         <w:t>payment</w:t>
       </w:r>
     </w:p>
@@ -11187,7 +12027,6 @@
                 <w:szCs w:val="26"/>
                 <w:lang w:val="vi-VN" w:eastAsia="vi-VN"/>
               </w:rPr>
-              <w:lastRenderedPageBreak/>
               <w:t>payment_amount</w:t>
             </w:r>
           </w:p>
@@ -11699,6 +12538,7 @@
                 <w:sz w:val="26"/>
                 <w:szCs w:val="26"/>
               </w:rPr>
+              <w:lastRenderedPageBreak/>
               <w:t>TIMESTAMP</w:t>
             </w:r>
           </w:p>

</xml_diff>